<commit_message>
Bulk out Session 1 with in-session practice; refresh Word docs
- Add instructor/in-session-practice.md: guided "Your turn" activities
  (Spot the mess, Clean it with me, Read the recorded steps) so Session 1
  comfortably fills 90 minutes and delivers the hands-on promise
- Expand session-1-run-of-show with a fuller minute-by-minute plan
- Regenerate Word (.docx) versions of all supplemental docs so they're
  current (new in-session-practice + refreshed run-of-show)

Co-Authored-By: Claude Opus 4.8 <noreply@anthropic.com>
</commit_message>
<xml_diff>
--- a/instructor/session-1-run-of-show.docx
+++ b/instructor/session-1-run-of-show.docx
@@ -2175,6 +2175,1106 @@
           <w:color w:val="101110"/>
           <w:sz w:val="30"/>
         </w:rPr>
+        <w:t>Expanded 90‑minute plan (recommended)</w:t>
+      </w:r>
+    </w:p>
+    <w:p>
+      <w:pPr>
+        <w:spacing w:after="120"/>
+      </w:pPr>
+      <w:r>
+        <w:rPr>
+          <w:rFonts w:ascii="Calibri" w:hAnsi="Calibri"/>
+          <w:color w:val="101110"/>
+          <w:sz w:val="22"/>
+        </w:rPr>
+        <w:t>Session 1's concepts present fast, so without hands‑on it can finish early. This version adds ~25 minutes of real activity and turns the clean‑up from a demo into a workshop. It assumes three small new slides (drop them in after the landscape):</w:t>
+      </w:r>
+    </w:p>
+    <w:p>
+      <w:pPr>
+        <w:pStyle w:val="ListBullet"/>
+        <w:spacing w:after="40"/>
+        <w:ind w:left="432" w:hanging="259"/>
+      </w:pPr>
+      <w:r>
+        <w:rPr>
+          <w:rFonts w:ascii="Calibri" w:hAnsi="Calibri"/>
+          <w:b/>
+          <w:color w:val="101110"/>
+          <w:sz w:val="22"/>
+        </w:rPr>
+        <w:t>"What makes data messy?"</w:t>
+      </w:r>
+      <w:r>
+        <w:rPr>
+          <w:rFonts w:ascii="Calibri" w:hAnsi="Calibri"/>
+          <w:color w:val="101110"/>
+          <w:sz w:val="22"/>
+        </w:rPr>
+        <w:t xml:space="preserve"> — the 9 problems in the file (agenda/list layout)</w:t>
+      </w:r>
+    </w:p>
+    <w:p>
+      <w:pPr>
+        <w:pStyle w:val="ListBullet"/>
+        <w:spacing w:after="40"/>
+        <w:ind w:left="432" w:hanging="259"/>
+      </w:pPr>
+      <w:r>
+        <w:rPr>
+          <w:rFonts w:ascii="Calibri" w:hAnsi="Calibri"/>
+          <w:b/>
+          <w:color w:val="101110"/>
+          <w:sz w:val="22"/>
+        </w:rPr>
+        <w:t>"Your turn: clean it with me"</w:t>
+      </w:r>
+      <w:r>
+        <w:rPr>
+          <w:rFonts w:ascii="Calibri" w:hAnsi="Calibri"/>
+          <w:color w:val="101110"/>
+          <w:sz w:val="22"/>
+        </w:rPr>
+        <w:t xml:space="preserve"> — the guided 5‑step mini‑clean (live‑demo layout)</w:t>
+      </w:r>
+    </w:p>
+    <w:p>
+      <w:pPr>
+        <w:pStyle w:val="ListBullet"/>
+        <w:spacing w:after="40"/>
+        <w:ind w:left="432" w:hanging="259"/>
+      </w:pPr>
+      <w:r>
+        <w:rPr>
+          <w:rFonts w:ascii="Calibri" w:hAnsi="Calibri"/>
+          <w:b/>
+          <w:color w:val="101110"/>
+          <w:sz w:val="22"/>
+        </w:rPr>
+        <w:t>"Read the recorded steps"</w:t>
+      </w:r>
+      <w:r>
+        <w:rPr>
+          <w:rFonts w:ascii="Calibri" w:hAnsi="Calibri"/>
+          <w:color w:val="101110"/>
+          <w:sz w:val="22"/>
+        </w:rPr>
+        <w:t xml:space="preserve"> — Applied Steps = your workflow (statement layout)</w:t>
+      </w:r>
+    </w:p>
+    <w:tbl>
+      <w:tblPr>
+        <w:tblStyle w:val="TableGrid"/>
+        <w:tblW w:type="auto" w:w="0"/>
+        <w:tblLook w:firstColumn="1" w:firstRow="1" w:lastColumn="0" w:lastRow="0" w:noHBand="0" w:noVBand="1" w:val="04A0"/>
+      </w:tblPr>
+      <w:tblGrid>
+        <w:gridCol w:w="2412"/>
+        <w:gridCol w:w="2412"/>
+        <w:gridCol w:w="2412"/>
+        <w:gridCol w:w="2412"/>
+      </w:tblGrid>
+      <w:tr>
+        <w:tc>
+          <w:tcPr>
+            <w:tcW w:type="dxa" w:w="2412"/>
+            <w:shd w:val="clear" w:fill="101110"/>
+          </w:tcPr>
+          <w:p>
+            <w:r>
+              <w:rPr>
+                <w:b/>
+                <w:color w:val="FFFFFF"/>
+              </w:rPr>
+            </w:r>
+            <w:r>
+              <w:rPr>
+                <w:rFonts w:ascii="Calibri" w:hAnsi="Calibri"/>
+                <w:b/>
+                <w:color w:val="FFFFFF"/>
+                <w:sz w:val="20"/>
+              </w:rPr>
+              <w:t>Time</w:t>
+            </w:r>
+          </w:p>
+        </w:tc>
+        <w:tc>
+          <w:tcPr>
+            <w:tcW w:type="dxa" w:w="2412"/>
+            <w:shd w:val="clear" w:fill="101110"/>
+          </w:tcPr>
+          <w:p>
+            <w:r>
+              <w:rPr>
+                <w:b/>
+                <w:color w:val="FFFFFF"/>
+              </w:rPr>
+            </w:r>
+            <w:r>
+              <w:rPr>
+                <w:rFonts w:ascii="Calibri" w:hAnsi="Calibri"/>
+                <w:b/>
+                <w:color w:val="FFFFFF"/>
+                <w:sz w:val="20"/>
+              </w:rPr>
+              <w:t>Min</w:t>
+            </w:r>
+          </w:p>
+        </w:tc>
+        <w:tc>
+          <w:tcPr>
+            <w:tcW w:type="dxa" w:w="2412"/>
+            <w:shd w:val="clear" w:fill="101110"/>
+          </w:tcPr>
+          <w:p>
+            <w:r>
+              <w:rPr>
+                <w:b/>
+                <w:color w:val="FFFFFF"/>
+              </w:rPr>
+            </w:r>
+            <w:r>
+              <w:rPr>
+                <w:rFonts w:ascii="Calibri" w:hAnsi="Calibri"/>
+                <w:b/>
+                <w:color w:val="FFFFFF"/>
+                <w:sz w:val="20"/>
+              </w:rPr>
+              <w:t>Segment</w:t>
+            </w:r>
+          </w:p>
+        </w:tc>
+        <w:tc>
+          <w:tcPr>
+            <w:tcW w:type="dxa" w:w="2412"/>
+            <w:shd w:val="clear" w:fill="101110"/>
+          </w:tcPr>
+          <w:p>
+            <w:r>
+              <w:rPr>
+                <w:b/>
+                <w:color w:val="FFFFFF"/>
+              </w:rPr>
+            </w:r>
+            <w:r>
+              <w:rPr>
+                <w:rFonts w:ascii="Calibri" w:hAnsi="Calibri"/>
+                <w:b/>
+                <w:color w:val="FFFFFF"/>
+                <w:sz w:val="20"/>
+              </w:rPr>
+              <w:t>Notes</w:t>
+            </w:r>
+          </w:p>
+        </w:tc>
+      </w:tr>
+      <w:tr>
+        <w:tc>
+          <w:tcPr>
+            <w:tcW w:type="dxa" w:w="2412"/>
+          </w:tcPr>
+          <w:p>
+            <w:r/>
+            <w:r>
+              <w:rPr>
+                <w:rFonts w:ascii="Calibri" w:hAnsi="Calibri"/>
+                <w:color w:val="101110"/>
+                <w:sz w:val="20"/>
+              </w:rPr>
+              <w:t>0:00</w:t>
+            </w:r>
+          </w:p>
+        </w:tc>
+        <w:tc>
+          <w:tcPr>
+            <w:tcW w:type="dxa" w:w="2412"/>
+          </w:tcPr>
+          <w:p>
+            <w:r/>
+            <w:r>
+              <w:rPr>
+                <w:rFonts w:ascii="Calibri" w:hAnsi="Calibri"/>
+                <w:color w:val="101110"/>
+                <w:sz w:val="20"/>
+              </w:rPr>
+              <w:t>5</w:t>
+            </w:r>
+          </w:p>
+        </w:tc>
+        <w:tc>
+          <w:tcPr>
+            <w:tcW w:type="dxa" w:w="2412"/>
+          </w:tcPr>
+          <w:p>
+            <w:r/>
+            <w:r>
+              <w:rPr>
+                <w:rFonts w:ascii="Calibri" w:hAnsi="Calibri"/>
+                <w:color w:val="101110"/>
+                <w:sz w:val="20"/>
+              </w:rPr>
+              <w:t>Welcome + premise</w:t>
+            </w:r>
+          </w:p>
+        </w:tc>
+        <w:tc>
+          <w:tcPr>
+            <w:tcW w:type="dxa" w:w="2412"/>
+          </w:tcPr>
+          <w:p>
+            <w:r/>
+            <w:r>
+              <w:rPr>
+                <w:rFonts w:ascii="Calibri" w:hAnsi="Calibri"/>
+                <w:color w:val="101110"/>
+                <w:sz w:val="20"/>
+              </w:rPr>
+              <w:t>As before.</w:t>
+            </w:r>
+          </w:p>
+        </w:tc>
+      </w:tr>
+      <w:tr>
+        <w:tc>
+          <w:tcPr>
+            <w:tcW w:type="dxa" w:w="2412"/>
+          </w:tcPr>
+          <w:p>
+            <w:r/>
+            <w:r>
+              <w:rPr>
+                <w:rFonts w:ascii="Calibri" w:hAnsi="Calibri"/>
+                <w:color w:val="101110"/>
+                <w:sz w:val="20"/>
+              </w:rPr>
+              <w:t>0:05</w:t>
+            </w:r>
+          </w:p>
+        </w:tc>
+        <w:tc>
+          <w:tcPr>
+            <w:tcW w:type="dxa" w:w="2412"/>
+          </w:tcPr>
+          <w:p>
+            <w:r/>
+            <w:r>
+              <w:rPr>
+                <w:rFonts w:ascii="Calibri" w:hAnsi="Calibri"/>
+                <w:color w:val="101110"/>
+                <w:sz w:val="20"/>
+              </w:rPr>
+              <w:t>7</w:t>
+            </w:r>
+          </w:p>
+        </w:tc>
+        <w:tc>
+          <w:tcPr>
+            <w:tcW w:type="dxa" w:w="2412"/>
+          </w:tcPr>
+          <w:p>
+            <w:r/>
+            <w:r>
+              <w:rPr>
+                <w:rFonts w:ascii="Calibri" w:hAnsi="Calibri"/>
+                <w:color w:val="101110"/>
+                <w:sz w:val="20"/>
+              </w:rPr>
+              <w:t>Landscape + trust</w:t>
+            </w:r>
+          </w:p>
+        </w:tc>
+        <w:tc>
+          <w:tcPr>
+            <w:tcW w:type="dxa" w:w="2412"/>
+          </w:tcPr>
+          <w:p>
+            <w:r/>
+            <w:r>
+              <w:rPr>
+                <w:rFonts w:ascii="Calibri" w:hAnsi="Calibri"/>
+                <w:color w:val="101110"/>
+                <w:sz w:val="20"/>
+              </w:rPr>
+              <w:t>Four tools, four jobs; what AI does well / where to check.</w:t>
+            </w:r>
+          </w:p>
+        </w:tc>
+      </w:tr>
+      <w:tr>
+        <w:tc>
+          <w:tcPr>
+            <w:tcW w:type="dxa" w:w="2412"/>
+          </w:tcPr>
+          <w:p>
+            <w:r/>
+            <w:r>
+              <w:rPr>
+                <w:rFonts w:ascii="Calibri" w:hAnsi="Calibri"/>
+                <w:color w:val="101110"/>
+                <w:sz w:val="20"/>
+              </w:rPr>
+              <w:t>0:12</w:t>
+            </w:r>
+          </w:p>
+        </w:tc>
+        <w:tc>
+          <w:tcPr>
+            <w:tcW w:type="dxa" w:w="2412"/>
+          </w:tcPr>
+          <w:p>
+            <w:r/>
+            <w:r>
+              <w:rPr>
+                <w:rFonts w:ascii="Calibri" w:hAnsi="Calibri"/>
+                <w:color w:val="101110"/>
+                <w:sz w:val="20"/>
+              </w:rPr>
+              <w:t>6</w:t>
+            </w:r>
+          </w:p>
+        </w:tc>
+        <w:tc>
+          <w:tcPr>
+            <w:tcW w:type="dxa" w:w="2412"/>
+          </w:tcPr>
+          <w:p>
+            <w:r/>
+            <w:r>
+              <w:rPr>
+                <w:rFonts w:ascii="Calibri" w:hAnsi="Calibri"/>
+                <w:color w:val="101110"/>
+                <w:sz w:val="20"/>
+              </w:rPr>
+              <w:t>Set up your toolkit</w:t>
+            </w:r>
+          </w:p>
+        </w:tc>
+        <w:tc>
+          <w:tcPr>
+            <w:tcW w:type="dxa" w:w="2412"/>
+          </w:tcPr>
+          <w:p>
+            <w:r/>
+            <w:r>
+              <w:rPr>
+                <w:rFonts w:ascii="Calibri" w:hAnsi="Calibri"/>
+                <w:color w:val="101110"/>
+                <w:sz w:val="20"/>
+              </w:rPr>
+              <w:t xml:space="preserve">Get everyone to a </w:t>
+            </w:r>
+            <w:r>
+              <w:rPr>
+                <w:rFonts w:ascii="Consolas" w:hAnsi="Consolas"/>
+                <w:color w:val="333333"/>
+                <w:sz w:val="20"/>
+              </w:rPr>
+              <w:t>=PY(</w:t>
+            </w:r>
+            <w:r>
+              <w:rPr>
+                <w:rFonts w:ascii="Calibri" w:hAnsi="Calibri"/>
+                <w:color w:val="101110"/>
+                <w:sz w:val="20"/>
+              </w:rPr>
+              <w:t xml:space="preserve"> cell, a Copilot button, or an assistant tab.</w:t>
+            </w:r>
+          </w:p>
+        </w:tc>
+      </w:tr>
+      <w:tr>
+        <w:tc>
+          <w:tcPr>
+            <w:tcW w:type="dxa" w:w="2412"/>
+          </w:tcPr>
+          <w:p>
+            <w:r/>
+            <w:r>
+              <w:rPr>
+                <w:rFonts w:ascii="Calibri" w:hAnsi="Calibri"/>
+                <w:color w:val="101110"/>
+                <w:sz w:val="20"/>
+              </w:rPr>
+              <w:t>0:18</w:t>
+            </w:r>
+          </w:p>
+        </w:tc>
+        <w:tc>
+          <w:tcPr>
+            <w:tcW w:type="dxa" w:w="2412"/>
+          </w:tcPr>
+          <w:p>
+            <w:r/>
+            <w:r>
+              <w:rPr>
+                <w:rFonts w:ascii="Calibri" w:hAnsi="Calibri"/>
+                <w:color w:val="101110"/>
+                <w:sz w:val="20"/>
+              </w:rPr>
+              <w:t>5</w:t>
+            </w:r>
+          </w:p>
+        </w:tc>
+        <w:tc>
+          <w:tcPr>
+            <w:tcW w:type="dxa" w:w="2412"/>
+          </w:tcPr>
+          <w:p>
+            <w:r/>
+            <w:r>
+              <w:rPr>
+                <w:rFonts w:ascii="Calibri" w:hAnsi="Calibri"/>
+                <w:b/>
+                <w:color w:val="101110"/>
+                <w:sz w:val="20"/>
+              </w:rPr>
+              <w:t>Spot the mess</w:t>
+            </w:r>
+            <w:r>
+              <w:rPr>
+                <w:rFonts w:ascii="Calibri" w:hAnsi="Calibri"/>
+                <w:color w:val="101110"/>
+                <w:sz w:val="20"/>
+              </w:rPr>
+              <w:t xml:space="preserve"> (Activity A)</w:t>
+            </w:r>
+          </w:p>
+        </w:tc>
+        <w:tc>
+          <w:tcPr>
+            <w:tcW w:type="dxa" w:w="2412"/>
+          </w:tcPr>
+          <w:p>
+            <w:r/>
+            <w:r>
+              <w:rPr>
+                <w:rFonts w:ascii="Calibri" w:hAnsi="Calibri"/>
+                <w:color w:val="101110"/>
+                <w:sz w:val="20"/>
+              </w:rPr>
+              <w:t>Chat: call out everything wrong with the raw file. Tally 9 problems.</w:t>
+            </w:r>
+          </w:p>
+        </w:tc>
+      </w:tr>
+      <w:tr>
+        <w:tc>
+          <w:tcPr>
+            <w:tcW w:type="dxa" w:w="2412"/>
+          </w:tcPr>
+          <w:p>
+            <w:r/>
+            <w:r>
+              <w:rPr>
+                <w:rFonts w:ascii="Calibri" w:hAnsi="Calibri"/>
+                <w:color w:val="101110"/>
+                <w:sz w:val="20"/>
+              </w:rPr>
+              <w:t>0:23</w:t>
+            </w:r>
+          </w:p>
+        </w:tc>
+        <w:tc>
+          <w:tcPr>
+            <w:tcW w:type="dxa" w:w="2412"/>
+          </w:tcPr>
+          <w:p>
+            <w:r/>
+            <w:r>
+              <w:rPr>
+                <w:rFonts w:ascii="Calibri" w:hAnsi="Calibri"/>
+                <w:color w:val="101110"/>
+                <w:sz w:val="20"/>
+              </w:rPr>
+              <w:t>15</w:t>
+            </w:r>
+          </w:p>
+        </w:tc>
+        <w:tc>
+          <w:tcPr>
+            <w:tcW w:type="dxa" w:w="2412"/>
+          </w:tcPr>
+          <w:p>
+            <w:r/>
+            <w:r>
+              <w:rPr>
+                <w:rFonts w:ascii="Calibri" w:hAnsi="Calibri"/>
+                <w:b/>
+                <w:color w:val="101110"/>
+                <w:sz w:val="20"/>
+              </w:rPr>
+              <w:t>Clean it with me</w:t>
+            </w:r>
+            <w:r>
+              <w:rPr>
+                <w:rFonts w:ascii="Calibri" w:hAnsi="Calibri"/>
+                <w:color w:val="101110"/>
+                <w:sz w:val="20"/>
+              </w:rPr>
+              <w:t xml:space="preserve"> (Activity B)</w:t>
+            </w:r>
+          </w:p>
+        </w:tc>
+        <w:tc>
+          <w:tcPr>
+            <w:tcW w:type="dxa" w:w="2412"/>
+          </w:tcPr>
+          <w:p>
+            <w:r/>
+            <w:r>
+              <w:rPr>
+                <w:rFonts w:ascii="Calibri" w:hAnsi="Calibri"/>
+                <w:color w:val="101110"/>
+                <w:sz w:val="20"/>
+              </w:rPr>
+              <w:t>Learners do the first 5 steps live; AI‑maps the regions together.</w:t>
+            </w:r>
+          </w:p>
+        </w:tc>
+      </w:tr>
+      <w:tr>
+        <w:tc>
+          <w:tcPr>
+            <w:tcW w:type="dxa" w:w="2412"/>
+          </w:tcPr>
+          <w:p>
+            <w:r/>
+            <w:r>
+              <w:rPr>
+                <w:rFonts w:ascii="Calibri" w:hAnsi="Calibri"/>
+                <w:color w:val="101110"/>
+                <w:sz w:val="20"/>
+              </w:rPr>
+              <w:t>0:38</w:t>
+            </w:r>
+          </w:p>
+        </w:tc>
+        <w:tc>
+          <w:tcPr>
+            <w:tcW w:type="dxa" w:w="2412"/>
+          </w:tcPr>
+          <w:p>
+            <w:r/>
+            <w:r>
+              <w:rPr>
+                <w:rFonts w:ascii="Calibri" w:hAnsi="Calibri"/>
+                <w:color w:val="101110"/>
+                <w:sz w:val="20"/>
+              </w:rPr>
+              <w:t>12</w:t>
+            </w:r>
+          </w:p>
+        </w:tc>
+        <w:tc>
+          <w:tcPr>
+            <w:tcW w:type="dxa" w:w="2412"/>
+          </w:tcPr>
+          <w:p>
+            <w:r/>
+            <w:r>
+              <w:rPr>
+                <w:rFonts w:ascii="Calibri" w:hAnsi="Calibri"/>
+                <w:color w:val="101110"/>
+                <w:sz w:val="20"/>
+              </w:rPr>
+              <w:t>Finish the clean (demo)</w:t>
+            </w:r>
+          </w:p>
+        </w:tc>
+        <w:tc>
+          <w:tcPr>
+            <w:tcW w:type="dxa" w:w="2412"/>
+          </w:tcPr>
+          <w:p>
+            <w:r/>
+            <w:r>
+              <w:rPr>
+                <w:rFonts w:ascii="Calibri" w:hAnsi="Calibri"/>
+                <w:color w:val="101110"/>
+                <w:sz w:val="20"/>
+              </w:rPr>
+              <w:t xml:space="preserve">You drive dedupe, the </w:t>
+            </w:r>
+            <w:r>
+              <w:rPr>
+                <w:rFonts w:ascii="Consolas" w:hAnsi="Consolas"/>
+                <w:color w:val="333333"/>
+                <w:sz w:val="20"/>
+              </w:rPr>
+              <w:t>two</w:t>
+            </w:r>
+            <w:r>
+              <w:rPr>
+                <w:rFonts w:ascii="Calibri" w:hAnsi="Calibri"/>
+                <w:color w:val="101110"/>
+                <w:sz w:val="20"/>
+              </w:rPr>
+              <w:t xml:space="preserve"> error, the TOTAL row; validate ≈248 rows / $555K.</w:t>
+            </w:r>
+          </w:p>
+        </w:tc>
+      </w:tr>
+      <w:tr>
+        <w:tc>
+          <w:tcPr>
+            <w:tcW w:type="dxa" w:w="2412"/>
+          </w:tcPr>
+          <w:p>
+            <w:r/>
+            <w:r>
+              <w:rPr>
+                <w:rFonts w:ascii="Calibri" w:hAnsi="Calibri"/>
+                <w:color w:val="101110"/>
+                <w:sz w:val="20"/>
+              </w:rPr>
+              <w:t>0:50</w:t>
+            </w:r>
+          </w:p>
+        </w:tc>
+        <w:tc>
+          <w:tcPr>
+            <w:tcW w:type="dxa" w:w="2412"/>
+          </w:tcPr>
+          <w:p>
+            <w:r/>
+            <w:r>
+              <w:rPr>
+                <w:rFonts w:ascii="Calibri" w:hAnsi="Calibri"/>
+                <w:color w:val="101110"/>
+                <w:sz w:val="20"/>
+              </w:rPr>
+              <w:t>5</w:t>
+            </w:r>
+          </w:p>
+        </w:tc>
+        <w:tc>
+          <w:tcPr>
+            <w:tcW w:type="dxa" w:w="2412"/>
+          </w:tcPr>
+          <w:p>
+            <w:r/>
+            <w:r>
+              <w:rPr>
+                <w:rFonts w:ascii="Calibri" w:hAnsi="Calibri"/>
+                <w:b/>
+                <w:color w:val="101110"/>
+                <w:sz w:val="20"/>
+              </w:rPr>
+              <w:t>Read the recorded steps</w:t>
+            </w:r>
+            <w:r>
+              <w:rPr>
+                <w:rFonts w:ascii="Calibri" w:hAnsi="Calibri"/>
+                <w:color w:val="101110"/>
+                <w:sz w:val="20"/>
+              </w:rPr>
+              <w:t xml:space="preserve"> (Activity C)</w:t>
+            </w:r>
+          </w:p>
+        </w:tc>
+        <w:tc>
+          <w:tcPr>
+            <w:tcW w:type="dxa" w:w="2412"/>
+          </w:tcPr>
+          <w:p>
+            <w:r/>
+            <w:r>
+              <w:rPr>
+                <w:rFonts w:ascii="Calibri" w:hAnsi="Calibri"/>
+                <w:color w:val="101110"/>
+                <w:sz w:val="20"/>
+              </w:rPr>
+              <w:t>Applied Steps = the workflow; AI explains one M step.</w:t>
+            </w:r>
+          </w:p>
+        </w:tc>
+      </w:tr>
+      <w:tr>
+        <w:tc>
+          <w:tcPr>
+            <w:tcW w:type="dxa" w:w="2412"/>
+          </w:tcPr>
+          <w:p>
+            <w:r/>
+            <w:r>
+              <w:rPr>
+                <w:rFonts w:ascii="Calibri" w:hAnsi="Calibri"/>
+                <w:color w:val="101110"/>
+                <w:sz w:val="20"/>
+              </w:rPr>
+              <w:t>0:55</w:t>
+            </w:r>
+          </w:p>
+        </w:tc>
+        <w:tc>
+          <w:tcPr>
+            <w:tcW w:type="dxa" w:w="2412"/>
+          </w:tcPr>
+          <w:p>
+            <w:r/>
+            <w:r>
+              <w:rPr>
+                <w:rFonts w:ascii="Calibri" w:hAnsi="Calibri"/>
+                <w:color w:val="101110"/>
+                <w:sz w:val="20"/>
+              </w:rPr>
+              <w:t>4</w:t>
+            </w:r>
+          </w:p>
+        </w:tc>
+        <w:tc>
+          <w:tcPr>
+            <w:tcW w:type="dxa" w:w="2412"/>
+          </w:tcPr>
+          <w:p>
+            <w:r/>
+            <w:r>
+              <w:rPr>
+                <w:rFonts w:ascii="Calibri" w:hAnsi="Calibri"/>
+                <w:color w:val="101110"/>
+                <w:sz w:val="20"/>
+              </w:rPr>
+              <w:t>Connect, don't paste</w:t>
+            </w:r>
+          </w:p>
+        </w:tc>
+        <w:tc>
+          <w:tcPr>
+            <w:tcW w:type="dxa" w:w="2412"/>
+          </w:tcPr>
+          <w:p>
+            <w:r/>
+            <w:r>
+              <w:rPr>
+                <w:rFonts w:ascii="Calibri" w:hAnsi="Calibri"/>
+                <w:color w:val="101110"/>
+                <w:sz w:val="20"/>
+              </w:rPr>
+              <w:t>The one habit. Then click Refresh to prove it.</w:t>
+            </w:r>
+          </w:p>
+        </w:tc>
+      </w:tr>
+      <w:tr>
+        <w:tc>
+          <w:tcPr>
+            <w:tcW w:type="dxa" w:w="2412"/>
+          </w:tcPr>
+          <w:p>
+            <w:r/>
+            <w:r>
+              <w:rPr>
+                <w:rFonts w:ascii="Calibri" w:hAnsi="Calibri"/>
+                <w:color w:val="101110"/>
+                <w:sz w:val="20"/>
+              </w:rPr>
+              <w:t>0:59</w:t>
+            </w:r>
+          </w:p>
+        </w:tc>
+        <w:tc>
+          <w:tcPr>
+            <w:tcW w:type="dxa" w:w="2412"/>
+          </w:tcPr>
+          <w:p>
+            <w:r/>
+            <w:r>
+              <w:rPr>
+                <w:rFonts w:ascii="Calibri" w:hAnsi="Calibri"/>
+                <w:color w:val="101110"/>
+                <w:sz w:val="20"/>
+              </w:rPr>
+              <w:t>6</w:t>
+            </w:r>
+          </w:p>
+        </w:tc>
+        <w:tc>
+          <w:tcPr>
+            <w:tcW w:type="dxa" w:w="2412"/>
+          </w:tcPr>
+          <w:p>
+            <w:r/>
+            <w:r>
+              <w:rPr>
+                <w:rFonts w:ascii="Calibri" w:hAnsi="Calibri"/>
+                <w:color w:val="101110"/>
+                <w:sz w:val="20"/>
+              </w:rPr>
+              <w:t>Responsible AI use</w:t>
+            </w:r>
+          </w:p>
+        </w:tc>
+        <w:tc>
+          <w:tcPr>
+            <w:tcW w:type="dxa" w:w="2412"/>
+          </w:tcPr>
+          <w:p>
+            <w:r/>
+            <w:r>
+              <w:rPr>
+                <w:rFonts w:ascii="Calibri" w:hAnsi="Calibri"/>
+                <w:color w:val="101110"/>
+                <w:sz w:val="20"/>
+              </w:rPr>
+              <w:t>The guardrails. Practical, not preachy.</w:t>
+            </w:r>
+          </w:p>
+        </w:tc>
+      </w:tr>
+      <w:tr>
+        <w:tc>
+          <w:tcPr>
+            <w:tcW w:type="dxa" w:w="2412"/>
+          </w:tcPr>
+          <w:p>
+            <w:r/>
+            <w:r>
+              <w:rPr>
+                <w:rFonts w:ascii="Calibri" w:hAnsi="Calibri"/>
+                <w:color w:val="101110"/>
+                <w:sz w:val="20"/>
+              </w:rPr>
+              <w:t>1:05</w:t>
+            </w:r>
+          </w:p>
+        </w:tc>
+        <w:tc>
+          <w:tcPr>
+            <w:tcW w:type="dxa" w:w="2412"/>
+          </w:tcPr>
+          <w:p>
+            <w:r/>
+            <w:r>
+              <w:rPr>
+                <w:rFonts w:ascii="Calibri" w:hAnsi="Calibri"/>
+                <w:color w:val="101110"/>
+                <w:sz w:val="20"/>
+              </w:rPr>
+              <w:t>4</w:t>
+            </w:r>
+          </w:p>
+        </w:tc>
+        <w:tc>
+          <w:tcPr>
+            <w:tcW w:type="dxa" w:w="2412"/>
+          </w:tcPr>
+          <w:p>
+            <w:r/>
+            <w:r>
+              <w:rPr>
+                <w:rFonts w:ascii="Calibri" w:hAnsi="Calibri"/>
+                <w:color w:val="101110"/>
+                <w:sz w:val="20"/>
+              </w:rPr>
+              <w:t>Key takeaways</w:t>
+            </w:r>
+          </w:p>
+        </w:tc>
+        <w:tc>
+          <w:tcPr>
+            <w:tcW w:type="dxa" w:w="2412"/>
+          </w:tcPr>
+          <w:p>
+            <w:r/>
+            <w:r>
+              <w:rPr>
+                <w:rFonts w:ascii="Calibri" w:hAnsi="Calibri"/>
+                <w:color w:val="101110"/>
+                <w:sz w:val="20"/>
+              </w:rPr>
+              <w:t>One‑word chat recap.</w:t>
+            </w:r>
+          </w:p>
+        </w:tc>
+      </w:tr>
+      <w:tr>
+        <w:tc>
+          <w:tcPr>
+            <w:tcW w:type="dxa" w:w="2412"/>
+          </w:tcPr>
+          <w:p>
+            <w:r/>
+            <w:r>
+              <w:rPr>
+                <w:rFonts w:ascii="Calibri" w:hAnsi="Calibri"/>
+                <w:color w:val="101110"/>
+                <w:sz w:val="20"/>
+              </w:rPr>
+              <w:t>1:09</w:t>
+            </w:r>
+          </w:p>
+        </w:tc>
+        <w:tc>
+          <w:tcPr>
+            <w:tcW w:type="dxa" w:w="2412"/>
+          </w:tcPr>
+          <w:p>
+            <w:r/>
+            <w:r>
+              <w:rPr>
+                <w:rFonts w:ascii="Calibri" w:hAnsi="Calibri"/>
+                <w:color w:val="101110"/>
+                <w:sz w:val="20"/>
+              </w:rPr>
+              <w:t>4</w:t>
+            </w:r>
+          </w:p>
+        </w:tc>
+        <w:tc>
+          <w:tcPr>
+            <w:tcW w:type="dxa" w:w="2412"/>
+          </w:tcPr>
+          <w:p>
+            <w:r/>
+            <w:r>
+              <w:rPr>
+                <w:rFonts w:ascii="Calibri" w:hAnsi="Calibri"/>
+                <w:color w:val="101110"/>
+                <w:sz w:val="20"/>
+              </w:rPr>
+              <w:t>Assignment</w:t>
+            </w:r>
+          </w:p>
+        </w:tc>
+        <w:tc>
+          <w:tcPr>
+            <w:tcW w:type="dxa" w:w="2412"/>
+          </w:tcPr>
+          <w:p>
+            <w:r/>
+            <w:r>
+              <w:rPr>
+                <w:rFonts w:ascii="Calibri" w:hAnsi="Calibri"/>
+                <w:color w:val="101110"/>
+                <w:sz w:val="20"/>
+              </w:rPr>
+              <w:t>Clean the file solo; post row count + total to Slack.</w:t>
+            </w:r>
+          </w:p>
+        </w:tc>
+      </w:tr>
+      <w:tr>
+        <w:tc>
+          <w:tcPr>
+            <w:tcW w:type="dxa" w:w="2412"/>
+          </w:tcPr>
+          <w:p>
+            <w:r/>
+            <w:r>
+              <w:rPr>
+                <w:rFonts w:ascii="Calibri" w:hAnsi="Calibri"/>
+                <w:color w:val="101110"/>
+                <w:sz w:val="20"/>
+              </w:rPr>
+              <w:t>1:13</w:t>
+            </w:r>
+          </w:p>
+        </w:tc>
+        <w:tc>
+          <w:tcPr>
+            <w:tcW w:type="dxa" w:w="2412"/>
+          </w:tcPr>
+          <w:p>
+            <w:r/>
+            <w:r>
+              <w:rPr>
+                <w:rFonts w:ascii="Calibri" w:hAnsi="Calibri"/>
+                <w:color w:val="101110"/>
+                <w:sz w:val="20"/>
+              </w:rPr>
+              <w:t>17</w:t>
+            </w:r>
+          </w:p>
+        </w:tc>
+        <w:tc>
+          <w:tcPr>
+            <w:tcW w:type="dxa" w:w="2412"/>
+          </w:tcPr>
+          <w:p>
+            <w:r/>
+            <w:r>
+              <w:rPr>
+                <w:rFonts w:ascii="Calibri" w:hAnsi="Calibri"/>
+                <w:color w:val="101110"/>
+                <w:sz w:val="20"/>
+              </w:rPr>
+              <w:t>Q&amp;A / troubleshooting</w:t>
+            </w:r>
+          </w:p>
+        </w:tc>
+        <w:tc>
+          <w:tcPr>
+            <w:tcW w:type="dxa" w:w="2412"/>
+          </w:tcPr>
+          <w:p>
+            <w:r/>
+            <w:r>
+              <w:rPr>
+                <w:rFonts w:ascii="Calibri" w:hAnsi="Calibri"/>
+                <w:color w:val="101110"/>
+                <w:sz w:val="20"/>
+              </w:rPr>
+              <w:t>Help people whose clean broke; setup stragglers.</w:t>
+            </w:r>
+          </w:p>
+        </w:tc>
+      </w:tr>
+    </w:tbl>
+    <w:p>
+      <w:pPr>
+        <w:spacing w:after="80"/>
+      </w:pPr>
+    </w:p>
+    <w:p>
+      <w:pPr>
+        <w:spacing w:after="120"/>
+      </w:pPr>
+      <w:r>
+        <w:rPr>
+          <w:rFonts w:ascii="Calibri" w:hAnsi="Calibri"/>
+          <w:b/>
+          <w:color w:val="101110"/>
+          <w:sz w:val="22"/>
+        </w:rPr>
+        <w:t>Total activity/content: ~73 min. Q&amp;A/buffer: ~17 min.</w:t>
+      </w:r>
+      <w:r>
+        <w:rPr>
+          <w:rFonts w:ascii="Calibri" w:hAnsi="Calibri"/>
+          <w:color w:val="101110"/>
+          <w:sz w:val="22"/>
+        </w:rPr>
+        <w:t xml:space="preserve"> Activities A–C are in [</w:t>
+      </w:r>
+      <w:r>
+        <w:rPr>
+          <w:rFonts w:ascii="Consolas" w:hAnsi="Consolas"/>
+          <w:color w:val="333333"/>
+          <w:sz w:val="22"/>
+        </w:rPr>
+        <w:t>in-session-practice.md</w:t>
+      </w:r>
+      <w:r>
+        <w:rPr>
+          <w:rFonts w:ascii="Calibri" w:hAnsi="Calibri"/>
+          <w:color w:val="101110"/>
+          <w:sz w:val="22"/>
+        </w:rPr>
+        <w:t>](in-session-practice.md).</w:t>
+      </w:r>
+    </w:p>
+    <w:p>
+      <w:pPr>
+        <w:spacing w:before="200" w:after="60"/>
+      </w:pPr>
+      <w:r>
+        <w:rPr>
+          <w:rFonts w:ascii="Calibri" w:hAnsi="Calibri"/>
+          <w:b/>
+          <w:color w:val="101110"/>
+          <w:sz w:val="30"/>
+        </w:rPr>
         <w:t>Common questions</w:t>
       </w:r>
     </w:p>

</xml_diff>